<commit_message>
fix: aplica interpretacao de negrito (rich_segments) nos textos das tabelas e cards
</commit_message>
<xml_diff>
--- a/2_Documentos_Prontos/REGULARIZACAO_164-2026 Antônio.docx
+++ b/2_Documentos_Prontos/REGULARIZACAO_164-2026 Antônio.docx
@@ -213,12 +213,12 @@
             <w:r>
               <w:rPr>
                 <w:rFonts w:ascii="Calibri" w:hAnsi="Calibri" w:cs="Calibri"/>
-                <w:b w:val="0"/>
+                <w:b/>
                 <w:i w:val="0"/>
                 <w:sz w:val="18"/>
                 <w:u w:val="none"/>
               </w:rPr>
-              <w:t>**Antônio Martins Neto**</w:t>
+              <w:t>Antônio Martins Neto</w:t>
             </w:r>
           </w:p>
         </w:tc>
@@ -381,12 +381,12 @@
             <w:r>
               <w:rPr>
                 <w:rFonts w:ascii="Calibri" w:hAnsi="Calibri" w:cs="Calibri"/>
-                <w:b w:val="0"/>
+                <w:b/>
                 <w:i w:val="0"/>
                 <w:sz w:val="18"/>
                 <w:u w:val="none"/>
               </w:rPr>
-              <w:t>**01.01.045.0067.001**</w:t>
+              <w:t>01.01.045.0067.001</w:t>
             </w:r>
           </w:p>
         </w:tc>
@@ -443,12 +443,12 @@
             <w:r>
               <w:rPr>
                 <w:rFonts w:ascii="Calibri" w:hAnsi="Calibri" w:cs="Calibri"/>
-                <w:b w:val="0"/>
+                <w:b/>
                 <w:i w:val="0"/>
                 <w:sz w:val="18"/>
                 <w:u w:val="none"/>
               </w:rPr>
-              <w:t>**Antônio Martins Neto**</w:t>
+              <w:t>Antônio Martins Neto</w:t>
             </w:r>
           </w:p>
         </w:tc>
@@ -500,15 +500,6 @@
               <w:jc w:val="left"/>
               <w:spacing w:line="220" w:lineRule="auto" w:before="25" w:after="25"/>
             </w:pPr>
-            <w:r>
-              <w:rPr>
-                <w:rFonts w:ascii="Calibri" w:hAnsi="Calibri" w:cs="Calibri"/>
-                <w:b w:val="0"/>
-                <w:i w:val="0"/>
-                <w:sz w:val="18"/>
-                <w:u w:val="none"/>
-              </w:rPr>
-            </w:r>
           </w:p>
         </w:tc>
       </w:tr>
@@ -686,12 +677,12 @@
             <w:r>
               <w:rPr>
                 <w:rFonts w:ascii="Calibri" w:hAnsi="Calibri" w:cs="Calibri"/>
-                <w:b w:val="0"/>
+                <w:b/>
                 <w:i w:val="0"/>
                 <w:sz w:val="18"/>
                 <w:u w:val="none"/>
               </w:rPr>
-              <w:t>**360,00m²**</w:t>
+              <w:t>360,00m²</w:t>
             </w:r>
           </w:p>
         </w:tc>
@@ -746,12 +737,12 @@
             <w:r>
               <w:rPr>
                 <w:rFonts w:ascii="Calibri" w:hAnsi="Calibri" w:cs="Calibri"/>
-                <w:b w:val="0"/>
+                <w:b/>
                 <w:i w:val="0"/>
                 <w:sz w:val="18"/>
                 <w:u w:val="none"/>
               </w:rPr>
-              <w:t>**283,38m²**</w:t>
+              <w:t>283,38m²</w:t>
             </w:r>
           </w:p>
         </w:tc>
@@ -990,12 +981,12 @@
             <w:r>
               <w:rPr>
                 <w:rFonts w:ascii="Calibri" w:hAnsi="Calibri" w:cs="Calibri"/>
-                <w:b w:val="0"/>
+                <w:b/>
                 <w:i w:val="0"/>
                 <w:sz w:val="18"/>
                 <w:u w:val="none"/>
               </w:rPr>
-              <w:t>**Samuel Dias**</w:t>
+              <w:t>Samuel Dias</w:t>
             </w:r>
           </w:p>
         </w:tc>
@@ -1589,12 +1580,78 @@
               <w:rPr>
                 <w:rFonts w:ascii="Calibri" w:hAnsi="Calibri" w:cs="Calibri"/>
                 <w:b w:val="0"/>
+                <w:i w:val="0"/>
+                <w:color w:val="444444"/>
+                <w:sz w:val="20"/>
+                <w:u w:val="none"/>
+              </w:rPr>
+              <w:t xml:space="preserve">Alvará emitido para regularização de imóvel edificado sem projeto aprovado pela prefeitura, referente à área total de </w:t>
+            </w:r>
+            <w:r>
+              <w:rPr>
+                <w:rFonts w:ascii="Calibri" w:hAnsi="Calibri" w:cs="Calibri"/>
+                <w:b/>
+                <w:i w:val="0"/>
+                <w:color w:val="444444"/>
+                <w:sz w:val="20"/>
+                <w:u w:val="none"/>
+              </w:rPr>
+              <w:t>283,38m²</w:t>
+            </w:r>
+            <w:r>
+              <w:rPr>
+                <w:rFonts w:ascii="Calibri" w:hAnsi="Calibri" w:cs="Calibri"/>
+                <w:b w:val="0"/>
+                <w:i w:val="0"/>
+                <w:color w:val="444444"/>
+                <w:sz w:val="20"/>
+                <w:u w:val="none"/>
+              </w:rPr>
+              <w:t xml:space="preserve">, mediante o cumprimento do </w:t>
+            </w:r>
+            <w:r>
+              <w:rPr>
+                <w:rFonts w:ascii="Calibri" w:hAnsi="Calibri" w:cs="Calibri"/>
+                <w:b w:val="0"/>
                 <w:i/>
                 <w:color w:val="444444"/>
                 <w:sz w:val="20"/>
                 <w:u w:val="none"/>
               </w:rPr>
-              <w:t>Alvará emitido para regularização de imóvel edificado sem projeto aprovado pela prefeitura, referente à área total de **283,38m²**, mediante o cumprimento do __Art. 79 da Lei 1.544 de 1986__ e __Art. 38, 39 da Lei Complementar 267 de 2019__.</w:t>
+              <w:t>Art. 79 da Lei 1.544 de 1986</w:t>
+            </w:r>
+            <w:r>
+              <w:rPr>
+                <w:rFonts w:ascii="Calibri" w:hAnsi="Calibri" w:cs="Calibri"/>
+                <w:b w:val="0"/>
+                <w:i w:val="0"/>
+                <w:color w:val="444444"/>
+                <w:sz w:val="20"/>
+                <w:u w:val="none"/>
+              </w:rPr>
+              <w:t xml:space="preserve"> e </w:t>
+            </w:r>
+            <w:r>
+              <w:rPr>
+                <w:rFonts w:ascii="Calibri" w:hAnsi="Calibri" w:cs="Calibri"/>
+                <w:b w:val="0"/>
+                <w:i/>
+                <w:color w:val="444444"/>
+                <w:sz w:val="20"/>
+                <w:u w:val="none"/>
+              </w:rPr>
+              <w:t>Art. 38, 39 da Lei Complementar 267 de 2019</w:t>
+            </w:r>
+            <w:r>
+              <w:rPr>
+                <w:rFonts w:ascii="Calibri" w:hAnsi="Calibri" w:cs="Calibri"/>
+                <w:b w:val="0"/>
+                <w:i w:val="0"/>
+                <w:color w:val="444444"/>
+                <w:sz w:val="20"/>
+                <w:u w:val="none"/>
+              </w:rPr>
+              <w:t>.</w:t>
             </w:r>
           </w:p>
         </w:tc>
@@ -1651,12 +1708,34 @@
               <w:rPr>
                 <w:rFonts w:ascii="Calibri" w:hAnsi="Calibri" w:cs="Calibri"/>
                 <w:b w:val="0"/>
-                <w:i/>
+                <w:i w:val="0"/>
                 <w:color w:val="444444"/>
                 <w:sz w:val="20"/>
                 <w:u w:val="none"/>
               </w:rPr>
-              <w:t>Referente à área total de **283,38m²**.</w:t>
+              <w:t xml:space="preserve">Referente à área total de </w:t>
+            </w:r>
+            <w:r>
+              <w:rPr>
+                <w:rFonts w:ascii="Calibri" w:hAnsi="Calibri" w:cs="Calibri"/>
+                <w:b/>
+                <w:i w:val="0"/>
+                <w:color w:val="444444"/>
+                <w:sz w:val="20"/>
+                <w:u w:val="none"/>
+              </w:rPr>
+              <w:t>283,38m²</w:t>
+            </w:r>
+            <w:r>
+              <w:rPr>
+                <w:rFonts w:ascii="Calibri" w:hAnsi="Calibri" w:cs="Calibri"/>
+                <w:b w:val="0"/>
+                <w:i w:val="0"/>
+                <w:color w:val="444444"/>
+                <w:sz w:val="20"/>
+                <w:u w:val="none"/>
+              </w:rPr>
+              <w:t>.</w:t>
             </w:r>
           </w:p>
         </w:tc>
@@ -1713,12 +1792,34 @@
               <w:rPr>
                 <w:rFonts w:ascii="Calibri" w:hAnsi="Calibri" w:cs="Calibri"/>
                 <w:b w:val="0"/>
-                <w:i/>
+                <w:i w:val="0"/>
                 <w:color w:val="444444"/>
                 <w:sz w:val="20"/>
                 <w:u w:val="none"/>
               </w:rPr>
-              <w:t>Referente à área total de **283,38m²**.</w:t>
+              <w:t xml:space="preserve">Referente à área total de </w:t>
+            </w:r>
+            <w:r>
+              <w:rPr>
+                <w:rFonts w:ascii="Calibri" w:hAnsi="Calibri" w:cs="Calibri"/>
+                <w:b/>
+                <w:i w:val="0"/>
+                <w:color w:val="444444"/>
+                <w:sz w:val="20"/>
+                <w:u w:val="none"/>
+              </w:rPr>
+              <w:t>283,38m²</w:t>
+            </w:r>
+            <w:r>
+              <w:rPr>
+                <w:rFonts w:ascii="Calibri" w:hAnsi="Calibri" w:cs="Calibri"/>
+                <w:b w:val="0"/>
+                <w:i w:val="0"/>
+                <w:color w:val="444444"/>
+                <w:sz w:val="20"/>
+                <w:u w:val="none"/>
+              </w:rPr>
+              <w:t>.</w:t>
             </w:r>
           </w:p>
         </w:tc>
@@ -1775,12 +1876,56 @@
               <w:rPr>
                 <w:rFonts w:ascii="Calibri" w:hAnsi="Calibri" w:cs="Calibri"/>
                 <w:b w:val="0"/>
-                <w:i/>
+                <w:i w:val="0"/>
                 <w:color w:val="444444"/>
                 <w:sz w:val="20"/>
                 <w:u w:val="none"/>
               </w:rPr>
-              <w:t>Conforme Planta Cadastral do município com Data de Cadastro em **13/11/2012**, atesta-se a existência consolidada de **163,72m²** de área construída no lote, garantindo a decadência para esta parcela do imóvel.</w:t>
+              <w:t xml:space="preserve">Conforme Planta Cadastral do município com Data de Cadastro em </w:t>
+            </w:r>
+            <w:r>
+              <w:rPr>
+                <w:rFonts w:ascii="Calibri" w:hAnsi="Calibri" w:cs="Calibri"/>
+                <w:b/>
+                <w:i w:val="0"/>
+                <w:color w:val="444444"/>
+                <w:sz w:val="20"/>
+                <w:u w:val="none"/>
+              </w:rPr>
+              <w:t>13/11/2012</w:t>
+            </w:r>
+            <w:r>
+              <w:rPr>
+                <w:rFonts w:ascii="Calibri" w:hAnsi="Calibri" w:cs="Calibri"/>
+                <w:b w:val="0"/>
+                <w:i w:val="0"/>
+                <w:color w:val="444444"/>
+                <w:sz w:val="20"/>
+                <w:u w:val="none"/>
+              </w:rPr>
+              <w:t xml:space="preserve">, atesta-se a existência consolidada de </w:t>
+            </w:r>
+            <w:r>
+              <w:rPr>
+                <w:rFonts w:ascii="Calibri" w:hAnsi="Calibri" w:cs="Calibri"/>
+                <w:b/>
+                <w:i w:val="0"/>
+                <w:color w:val="444444"/>
+                <w:sz w:val="20"/>
+                <w:u w:val="none"/>
+              </w:rPr>
+              <w:t>163,72m²</w:t>
+            </w:r>
+            <w:r>
+              <w:rPr>
+                <w:rFonts w:ascii="Calibri" w:hAnsi="Calibri" w:cs="Calibri"/>
+                <w:b w:val="0"/>
+                <w:i w:val="0"/>
+                <w:color w:val="444444"/>
+                <w:sz w:val="20"/>
+                <w:u w:val="none"/>
+              </w:rPr>
+              <w:t xml:space="preserve"> de área construída no lote, garantindo a decadência para esta parcela do imóvel.</w:t>
             </w:r>
           </w:p>
         </w:tc>

</xml_diff>

<commit_message>
feat: injeção da personalidade Antigravity no GEM e consolidação do treinamento
</commit_message>
<xml_diff>
--- a/2_Documentos_Prontos/REGULARIZACAO_164-2026 Antônio.docx
+++ b/2_Documentos_Prontos/REGULARIZACAO_164-2026 Antônio.docx
@@ -156,7 +156,7 @@
                 <w:sz w:val="18"/>
                 <w:u w:val="none"/>
               </w:rPr>
-              <w:t>Regularização</w:t>
+              <w:t>Regularização de Edificação 'As Built' com Declaração de Decadência Parcial</w:t>
             </w:r>
           </w:p>
         </w:tc>
@@ -682,7 +682,7 @@
                 <w:sz w:val="18"/>
                 <w:u w:val="none"/>
               </w:rPr>
-              <w:t>360,00m²</w:t>
+              <w:t>240,00m²</w:t>
             </w:r>
           </w:p>
         </w:tc>
@@ -799,12 +799,24 @@
             <w:r>
               <w:rPr>
                 <w:rFonts w:ascii="Calibri" w:hAnsi="Calibri" w:cs="Calibri"/>
-                <w:b w:val="0"/>
+                <w:b/>
                 <w:i w:val="0"/>
+                <w:color w:val="CC0000"/>
                 <w:sz w:val="18"/>
                 <w:u w:val="none"/>
               </w:rPr>
-              <w:t>Não informada</w:t>
+              <w:t>118,08%</w:t>
+            </w:r>
+            <w:r>
+              <w:rPr>
+                <w:rFonts w:ascii="Calibri" w:hAnsi="Calibri" w:cs="Calibri"/>
+                <w:b/>
+                <w:i/>
+                <w:color w:val="CC0000"/>
+                <w:sz w:val="14"/>
+                <w:u w:val="none"/>
+              </w:rPr>
+              <w:t xml:space="preserve">  (conferir zoneamento)</w:t>
             </w:r>
           </w:p>
         </w:tc>
@@ -859,12 +871,12 @@
             <w:r>
               <w:rPr>
                 <w:rFonts w:ascii="Calibri" w:hAnsi="Calibri" w:cs="Calibri"/>
-                <w:b w:val="0"/>
+                <w:b/>
                 <w:i w:val="0"/>
                 <w:sz w:val="18"/>
                 <w:u w:val="none"/>
               </w:rPr>
-              <w:t>Não informado</w:t>
+              <w:t>1,18</w:t>
             </w:r>
           </w:p>
         </w:tc>
@@ -921,12 +933,24 @@
             <w:r>
               <w:rPr>
                 <w:rFonts w:ascii="Calibri" w:hAnsi="Calibri" w:cs="Calibri"/>
-                <w:b w:val="0"/>
+                <w:b/>
                 <w:i w:val="0"/>
+                <w:color w:val="CC0000"/>
                 <w:sz w:val="18"/>
                 <w:u w:val="none"/>
               </w:rPr>
-              <w:t>Não informada</w:t>
+              <w:t>0,00%</w:t>
+            </w:r>
+            <w:r>
+              <w:rPr>
+                <w:rFonts w:ascii="Calibri" w:hAnsi="Calibri" w:cs="Calibri"/>
+                <w:b/>
+                <w:i/>
+                <w:color w:val="CC0000"/>
+                <w:sz w:val="14"/>
+                <w:u w:val="none"/>
+              </w:rPr>
+              <w:t xml:space="preserve">  (conferir zoneamento)</w:t>
             </w:r>
           </w:p>
         </w:tc>
@@ -1014,7 +1038,7 @@
           <w:sz w:val="22"/>
           <w:u w:val="none"/>
         </w:rPr>
-        <w:t xml:space="preserve">A Secretaria Municipal de Obras e Serviços Urbanos, através do Departamento Técnico, em face deste Processo Administrativo nº </w:t>
+        <w:t xml:space="preserve">A Secretaria Municipal de Obras e Serviços Urbanos (SMOSU), por intermédio de seu Departamento Técnico, apresenta a análise de viabilidade para o Processo Administrativo nº </w:t>
       </w:r>
       <w:r>
         <w:rPr>
@@ -1034,7 +1058,7 @@
           <w:sz w:val="22"/>
           <w:u w:val="none"/>
         </w:rPr>
-        <w:t xml:space="preserve">, onde o requerente </w:t>
+        <w:t xml:space="preserve">, no qual o requerente </w:t>
       </w:r>
       <w:r>
         <w:rPr>
@@ -1054,7 +1078,7 @@
           <w:sz w:val="22"/>
           <w:u w:val="none"/>
         </w:rPr>
-        <w:t xml:space="preserve"> solicita a regularização de obra para edificação residencial, com área total construída de </w:t>
+        <w:t xml:space="preserve"> postula a regularização em modalidade 'As Built' de uma edificação de uso residencial multifamiliar, totalizando </w:t>
       </w:r>
       <w:r>
         <w:rPr>
@@ -1074,7 +1098,7 @@
           <w:sz w:val="22"/>
           <w:u w:val="none"/>
         </w:rPr>
-        <w:t xml:space="preserve">. A edificação está inserida em uma fração ideal de </w:t>
+        <w:t xml:space="preserve"> de área construída. O imóvel encontra-se assentado sobre uma fração ideal de </w:t>
       </w:r>
       <w:r>
         <w:rPr>
@@ -1094,27 +1118,7 @@
           <w:sz w:val="22"/>
           <w:u w:val="none"/>
         </w:rPr>
-        <w:t xml:space="preserve">, pertencente a um terreno com área total de </w:t>
-      </w:r>
-      <w:r>
-        <w:rPr>
-          <w:rFonts w:ascii="Calibri" w:hAnsi="Calibri" w:cs="Calibri"/>
-          <w:b/>
-          <w:i w:val="0"/>
-          <w:sz w:val="22"/>
-          <w:u w:val="none"/>
-        </w:rPr>
-        <w:t>360,00m²</w:t>
-      </w:r>
-      <w:r>
-        <w:rPr>
-          <w:rFonts w:ascii="Calibri" w:hAnsi="Calibri" w:cs="Calibri"/>
-          <w:b w:val="0"/>
-          <w:i w:val="0"/>
-          <w:sz w:val="22"/>
-          <w:u w:val="none"/>
-        </w:rPr>
-        <w:t xml:space="preserve">. Localizado no zoneamento </w:t>
+        <w:t xml:space="preserve"> – desmembrada de um lote originário de 360,00m² –, situado no zoneamento </w:t>
       </w:r>
       <w:r>
         <w:rPr>
@@ -1134,7 +1138,208 @@
           <w:sz w:val="22"/>
           <w:u w:val="none"/>
         </w:rPr>
-        <w:t xml:space="preserve"> na Rua Doutor Odorico Ribeiro, nº 107, Bairro Acácio Ribeiro, onde de acordo com o parecer fiscal emitido por </w:t>
+        <w:t>, sob a jurisdição fiscal e urbana do município de Oliveira/MG.</w:t>
+      </w:r>
+    </w:p>
+    <w:p>
+      <w:pPr>
+        <w:ind w:firstLine="709"/>
+        <w:jc w:val="both"/>
+        <w:spacing w:line="288" w:lineRule="auto" w:before="0" w:after="120"/>
+      </w:pPr>
+      <w:r>
+        <w:rPr>
+          <w:rFonts w:ascii="Calibri" w:hAnsi="Calibri" w:cs="Calibri"/>
+          <w:b/>
+          <w:i w:val="0"/>
+          <w:sz w:val="22"/>
+          <w:u w:val="none"/>
+        </w:rPr>
+        <w:t xml:space="preserve">Considerando que </w:t>
+      </w:r>
+      <w:r>
+        <w:rPr>
+          <w:rFonts w:ascii="Calibri" w:hAnsi="Calibri" w:cs="Calibri"/>
+          <w:b w:val="0"/>
+          <w:i w:val="0"/>
+          <w:sz w:val="22"/>
+          <w:u w:val="none"/>
+        </w:rPr>
+        <w:t xml:space="preserve">A análise da cadeia sucessória e titularidade atestada pela </w:t>
+      </w:r>
+      <w:r>
+        <w:rPr>
+          <w:rFonts w:ascii="Calibri" w:hAnsi="Calibri" w:cs="Calibri"/>
+          <w:b/>
+          <w:i w:val="0"/>
+          <w:sz w:val="22"/>
+          <w:u w:val="none"/>
+        </w:rPr>
+        <w:t>Matrícula de Inteiro Teor nº 9833</w:t>
+      </w:r>
+      <w:r>
+        <w:rPr>
+          <w:rFonts w:ascii="Calibri" w:hAnsi="Calibri" w:cs="Calibri"/>
+          <w:b w:val="0"/>
+          <w:i w:val="0"/>
+          <w:sz w:val="22"/>
+          <w:u w:val="none"/>
+        </w:rPr>
+        <w:t xml:space="preserve"> (Serviço de Registro de Imóveis local) e Inscrição Cadastral nº </w:t>
+      </w:r>
+      <w:r>
+        <w:rPr>
+          <w:rFonts w:ascii="Calibri" w:hAnsi="Calibri" w:cs="Calibri"/>
+          <w:b/>
+          <w:i w:val="0"/>
+          <w:sz w:val="22"/>
+          <w:u w:val="none"/>
+        </w:rPr>
+        <w:t>01.01.045.0067.001</w:t>
+      </w:r>
+      <w:r>
+        <w:rPr>
+          <w:rFonts w:ascii="Calibri" w:hAnsi="Calibri" w:cs="Calibri"/>
+          <w:b w:val="0"/>
+          <w:i w:val="0"/>
+          <w:sz w:val="22"/>
+          <w:u w:val="none"/>
+        </w:rPr>
+        <w:t>, comprovando o pleno domínio do requerente sobre a fração ideal delimitada do Lote 17, Quadra 06;</w:t>
+      </w:r>
+    </w:p>
+    <w:p>
+      <w:pPr>
+        <w:ind w:firstLine="709"/>
+        <w:jc w:val="both"/>
+        <w:spacing w:line="288" w:lineRule="auto" w:before="0" w:after="120"/>
+      </w:pPr>
+      <w:r>
+        <w:rPr>
+          <w:rFonts w:ascii="Calibri" w:hAnsi="Calibri" w:cs="Calibri"/>
+          <w:b/>
+          <w:i w:val="0"/>
+          <w:sz w:val="22"/>
+          <w:u w:val="none"/>
+        </w:rPr>
+        <w:t xml:space="preserve">Considerando que </w:t>
+      </w:r>
+      <w:r>
+        <w:rPr>
+          <w:rFonts w:ascii="Calibri" w:hAnsi="Calibri" w:cs="Calibri"/>
+          <w:b w:val="0"/>
+          <w:i w:val="0"/>
+          <w:sz w:val="22"/>
+          <w:u w:val="none"/>
+        </w:rPr>
+        <w:t xml:space="preserve">O Laudo Técnico de Estabilidade Estrutural e Funcional, devidamente instruído com o projeto arquitetônico levantado (As Built), sob a responsabilidade técnica do Engenheiro Civil </w:t>
+      </w:r>
+      <w:r>
+        <w:rPr>
+          <w:rFonts w:ascii="Calibri" w:hAnsi="Calibri" w:cs="Calibri"/>
+          <w:b/>
+          <w:i w:val="0"/>
+          <w:sz w:val="22"/>
+          <w:u w:val="none"/>
+        </w:rPr>
+        <w:t>Samuel Dias</w:t>
+      </w:r>
+      <w:r>
+        <w:rPr>
+          <w:rFonts w:ascii="Calibri" w:hAnsi="Calibri" w:cs="Calibri"/>
+          <w:b w:val="0"/>
+          <w:i w:val="0"/>
+          <w:sz w:val="22"/>
+          <w:u w:val="none"/>
+        </w:rPr>
+        <w:t xml:space="preserve"> (CREA-MG </w:t>
+      </w:r>
+      <w:r>
+        <w:rPr>
+          <w:rFonts w:ascii="Calibri" w:hAnsi="Calibri" w:cs="Calibri"/>
+          <w:b/>
+          <w:i w:val="0"/>
+          <w:sz w:val="22"/>
+          <w:u w:val="none"/>
+        </w:rPr>
+        <w:t>201.767/D</w:t>
+      </w:r>
+      <w:r>
+        <w:rPr>
+          <w:rFonts w:ascii="Calibri" w:hAnsi="Calibri" w:cs="Calibri"/>
+          <w:b w:val="0"/>
+          <w:i w:val="0"/>
+          <w:sz w:val="22"/>
+          <w:u w:val="none"/>
+        </w:rPr>
+        <w:t xml:space="preserve">), com a respectiva ART de nº </w:t>
+      </w:r>
+      <w:r>
+        <w:rPr>
+          <w:rFonts w:ascii="Calibri" w:hAnsi="Calibri" w:cs="Calibri"/>
+          <w:b/>
+          <w:i w:val="0"/>
+          <w:sz w:val="22"/>
+          <w:u w:val="none"/>
+        </w:rPr>
+        <w:t>MG20254540522</w:t>
+      </w:r>
+      <w:r>
+        <w:rPr>
+          <w:rFonts w:ascii="Calibri" w:hAnsi="Calibri" w:cs="Calibri"/>
+          <w:b w:val="0"/>
+          <w:i w:val="0"/>
+          <w:sz w:val="22"/>
+          <w:u w:val="none"/>
+        </w:rPr>
+        <w:t xml:space="preserve"> registrada e baixada, garantindo que as fundações e estruturas da obra possuem segurança plena e vida útil resguardada;</w:t>
+      </w:r>
+    </w:p>
+    <w:p>
+      <w:pPr>
+        <w:ind w:firstLine="709"/>
+        <w:jc w:val="both"/>
+        <w:spacing w:line="288" w:lineRule="auto" w:before="0" w:after="120"/>
+      </w:pPr>
+      <w:r>
+        <w:rPr>
+          <w:rFonts w:ascii="Calibri" w:hAnsi="Calibri" w:cs="Calibri"/>
+          <w:b/>
+          <w:i w:val="0"/>
+          <w:sz w:val="22"/>
+          <w:u w:val="none"/>
+        </w:rPr>
+        <w:t xml:space="preserve">Considerando que </w:t>
+      </w:r>
+      <w:r>
+        <w:rPr>
+          <w:rFonts w:ascii="Calibri" w:hAnsi="Calibri" w:cs="Calibri"/>
+          <w:b w:val="0"/>
+          <w:i w:val="0"/>
+          <w:sz w:val="22"/>
+          <w:u w:val="none"/>
+        </w:rPr>
+        <w:t xml:space="preserve">A diligência técnica *in loco* materializada no Parecer Fiscal (Data: </w:t>
+      </w:r>
+      <w:r>
+        <w:rPr>
+          <w:rFonts w:ascii="Calibri" w:hAnsi="Calibri" w:cs="Calibri"/>
+          <w:b/>
+          <w:i w:val="0"/>
+          <w:sz w:val="22"/>
+          <w:u w:val="none"/>
+        </w:rPr>
+        <w:t>09/03/2026</w:t>
+      </w:r>
+      <w:r>
+        <w:rPr>
+          <w:rFonts w:ascii="Calibri" w:hAnsi="Calibri" w:cs="Calibri"/>
+          <w:b w:val="0"/>
+          <w:i w:val="0"/>
+          <w:sz w:val="22"/>
+          <w:u w:val="none"/>
+        </w:rPr>
+        <w:t xml:space="preserve">), subscrito pelos fiscais </w:t>
       </w:r>
       <w:r>
         <w:rPr>
@@ -1174,7 +1379,7 @@
           <w:sz w:val="22"/>
           <w:u w:val="none"/>
         </w:rPr>
-        <w:t>, a construção se encontra finalizada, habitável e confere com o projeto apresentado.</w:t>
+        <w:t>, o qual ratifica que o complexo residencial encontra-se fisicamente consolidado, plenamente habitável, dotado de instalações hidrossanitárias adequadas e refletindo estritamente as cotas apresentadas nas pranchas;</w:t>
       </w:r>
     </w:p>
     <w:p>
@@ -1201,7 +1406,7 @@
           <w:sz w:val="22"/>
           <w:u w:val="none"/>
         </w:rPr>
-        <w:t xml:space="preserve">o requerente apresentou Título de Propriedade com MATRÍCULA DE INTEIRO TEOR sob nº </w:t>
+        <w:t xml:space="preserve">A consulta ao acervo cartográfico da Prefeitura Municipal, especificamente a </w:t>
       </w:r>
       <w:r>
         <w:rPr>
@@ -1211,7 +1416,7 @@
           <w:sz w:val="22"/>
           <w:u w:val="none"/>
         </w:rPr>
-        <w:t>9833</w:t>
+        <w:t>Planta Cadastral datada de 13/11/2012</w:t>
       </w:r>
       <w:r>
         <w:rPr>
@@ -1221,7 +1426,7 @@
           <w:sz w:val="22"/>
           <w:u w:val="none"/>
         </w:rPr>
-        <w:t xml:space="preserve"> (Lote 17, da quadra 06, fração ideal de </w:t>
+        <w:t xml:space="preserve">, que configura prova irrefutável da preexistência de um volume edificado de </w:t>
       </w:r>
       <w:r>
         <w:rPr>
@@ -1231,7 +1436,7 @@
           <w:sz w:val="22"/>
           <w:u w:val="none"/>
         </w:rPr>
-        <w:t>240,00m²</w:t>
+        <w:t>163,72m²</w:t>
       </w:r>
       <w:r>
         <w:rPr>
@@ -1241,27 +1446,7 @@
           <w:sz w:val="22"/>
           <w:u w:val="none"/>
         </w:rPr>
-        <w:t xml:space="preserve">) e Inscrição Cadastral </w:t>
-      </w:r>
-      <w:r>
-        <w:rPr>
-          <w:rFonts w:ascii="Calibri" w:hAnsi="Calibri" w:cs="Calibri"/>
-          <w:b/>
-          <w:i w:val="0"/>
-          <w:sz w:val="22"/>
-          <w:u w:val="none"/>
-        </w:rPr>
-        <w:t>01.01.045.0067.001</w:t>
-      </w:r>
-      <w:r>
-        <w:rPr>
-          <w:rFonts w:ascii="Calibri" w:hAnsi="Calibri" w:cs="Calibri"/>
-          <w:b w:val="0"/>
-          <w:i w:val="0"/>
-          <w:sz w:val="22"/>
-          <w:u w:val="none"/>
-        </w:rPr>
-        <w:t>.</w:t>
+        <w:t xml:space="preserve"> naquele marco temporal histórico, consolidando o fato gerador pretérito;</w:t>
       </w:r>
     </w:p>
     <w:p>
@@ -1288,7 +1473,7 @@
           <w:sz w:val="22"/>
           <w:u w:val="none"/>
         </w:rPr>
-        <w:t xml:space="preserve">Para o laudo técnico de estabilidade (Data: </w:t>
+        <w:t xml:space="preserve">A superação dos índices urbanísticos vigentes para a </w:t>
       </w:r>
       <w:r>
         <w:rPr>
@@ -1298,7 +1483,7 @@
           <w:sz w:val="22"/>
           <w:u w:val="none"/>
         </w:rPr>
-        <w:t>15/12/2025</w:t>
+        <w:t>ZUR 03</w:t>
       </w:r>
       <w:r>
         <w:rPr>
@@ -1308,7 +1493,24 @@
           <w:sz w:val="22"/>
           <w:u w:val="none"/>
         </w:rPr>
-        <w:t xml:space="preserve">) e Projeto As Built, foi emitida a Anotação de Responsabilidade Técnica (ART) nº </w:t>
+        <w:t xml:space="preserve"> (Taxa de Ocupação de 118,08% e Permeabilidade nula), cuja excepcionalidade se fundamenta no caráter de regularização de obra antiga consolidada, amparada pelos mecanismos compensatórios e pecuniários previstos na legislação moderna.</w:t>
+      </w:r>
+    </w:p>
+    <w:p>
+      <w:pPr>
+        <w:ind w:firstLine="709"/>
+        <w:jc w:val="both"/>
+        <w:spacing w:line="288" w:lineRule="auto" w:before="0" w:after="120"/>
+      </w:pPr>
+      <w:r>
+        <w:rPr>
+          <w:rFonts w:ascii="Calibri" w:hAnsi="Calibri" w:cs="Calibri"/>
+          <w:b w:val="0"/>
+          <w:i w:val="0"/>
+          <w:sz w:val="22"/>
+          <w:u w:val="none"/>
+        </w:rPr>
+        <w:t xml:space="preserve">Em análise à preexistência da edificação, o instituto da </w:t>
       </w:r>
       <w:r>
         <w:rPr>
@@ -1318,7 +1520,7 @@
           <w:sz w:val="22"/>
           <w:u w:val="none"/>
         </w:rPr>
-        <w:t>MG20254540522</w:t>
+        <w:t>Decadência</w:t>
       </w:r>
       <w:r>
         <w:rPr>
@@ -1328,7 +1530,7 @@
           <w:sz w:val="22"/>
           <w:u w:val="none"/>
         </w:rPr>
-        <w:t xml:space="preserve"> pelo profissional Engenheiro Civil </w:t>
+        <w:t xml:space="preserve"> deve ser aplicado. Conforme consolidado na jurisprudência administrativa e no Código Tributário do Município, o ente público perde o direito de lançar e cobrar tributos e taxas referentes ao ato construtivo (como o ISS-Construção Civil e penalidades de obra irregular) sobre fatos geradores ocorridos há mais de 5 (cinco) anos. Portanto, atesta-se a decadência integral sobre a parcela de </w:t>
       </w:r>
       <w:r>
         <w:rPr>
@@ -1338,27 +1540,7 @@
           <w:sz w:val="22"/>
           <w:u w:val="none"/>
         </w:rPr>
-        <w:t>Samuel Dias</w:t>
-      </w:r>
-      <w:r>
-        <w:rPr>
-          <w:rFonts w:ascii="Calibri" w:hAnsi="Calibri" w:cs="Calibri"/>
-          <w:b w:val="0"/>
-          <w:i w:val="0"/>
-          <w:sz w:val="22"/>
-          <w:u w:val="none"/>
-        </w:rPr>
-        <w:t xml:space="preserve"> CREA-MG nº </w:t>
-      </w:r>
-      <w:r>
-        <w:rPr>
-          <w:rFonts w:ascii="Calibri" w:hAnsi="Calibri" w:cs="Calibri"/>
-          <w:b/>
-          <w:i w:val="0"/>
-          <w:sz w:val="22"/>
-          <w:u w:val="none"/>
-        </w:rPr>
-        <w:t>201.767/D</w:t>
+        <w:t>163,72m²</w:t>
       </w:r>
       <w:r>
         <w:rPr>
@@ -1369,6 +1551,43 @@
           <w:u w:val="none"/>
         </w:rPr>
         <w:t>.</w:t>
+      </w:r>
+    </w:p>
+    <w:p>
+      <w:pPr>
+        <w:ind w:firstLine="709"/>
+        <w:jc w:val="both"/>
+        <w:spacing w:line="288" w:lineRule="auto" w:before="0" w:after="120"/>
+      </w:pPr>
+      <w:r>
+        <w:rPr>
+          <w:rFonts w:ascii="Calibri" w:hAnsi="Calibri" w:cs="Calibri"/>
+          <w:b w:val="0"/>
+          <w:i w:val="0"/>
+          <w:sz w:val="22"/>
+          <w:u w:val="none"/>
+        </w:rPr>
+        <w:t xml:space="preserve">Em contrapartida, a fração restante de </w:t>
+      </w:r>
+      <w:r>
+        <w:rPr>
+          <w:rFonts w:ascii="Calibri" w:hAnsi="Calibri" w:cs="Calibri"/>
+          <w:b/>
+          <w:i w:val="0"/>
+          <w:sz w:val="22"/>
+          <w:u w:val="none"/>
+        </w:rPr>
+        <w:t>119,66m²</w:t>
+      </w:r>
+      <w:r>
+        <w:rPr>
+          <w:rFonts w:ascii="Calibri" w:hAnsi="Calibri" w:cs="Calibri"/>
+          <w:b w:val="0"/>
+          <w:i w:val="0"/>
+          <w:sz w:val="22"/>
+          <w:u w:val="none"/>
+        </w:rPr>
+        <w:t xml:space="preserve"> (resultante da subtração da área total atual de 283,38m² pela área consolidada de 163,72m²) caracteriza-se como ampliação não averbada executada no quinquênio recente, recaindo sobre esta os devidos lançamentos de taxas de regularização e compensação financeira pelo excedente construtivo.</w:t>
       </w:r>
     </w:p>
     <w:p>
@@ -1409,11 +1628,38 @@
         <w:rPr>
           <w:rFonts w:ascii="Calibri" w:hAnsi="Calibri" w:cs="Calibri"/>
           <w:b w:val="0"/>
+          <w:i/>
+          <w:sz w:val="22"/>
+          <w:u w:val="none"/>
+        </w:rPr>
+        <w:t>Decreto Municipal nº 4.149 de 19/12/2019</w:t>
+      </w:r>
+      <w:r>
+        <w:rPr>
+          <w:rFonts w:ascii="Calibri" w:hAnsi="Calibri" w:cs="Calibri"/>
+          <w:b w:val="0"/>
           <w:i w:val="0"/>
           <w:sz w:val="22"/>
           <w:u w:val="none"/>
         </w:rPr>
-        <w:t xml:space="preserve">Considerando que o setor técnico salienta que no que tange a Legislação </w:t>
+        <w:t>, que disciplina os procedimentos e fluxos para a regularização imobiliária 'As Built' no município de Oliveira;</w:t>
+      </w:r>
+    </w:p>
+    <w:p>
+      <w:pPr>
+        <w:ind w:firstLine="709"/>
+        <w:jc w:val="both"/>
+        <w:spacing w:line="288" w:lineRule="auto" w:before="0" w:after="120"/>
+      </w:pPr>
+      <w:r>
+        <w:rPr>
+          <w:rFonts w:ascii="Calibri" w:hAnsi="Calibri" w:cs="Calibri"/>
+          <w:b w:val="0"/>
+          <w:i w:val="0"/>
+          <w:sz w:val="22"/>
+          <w:u w:val="none"/>
+        </w:rPr>
+        <w:t xml:space="preserve">• </w:t>
       </w:r>
       <w:r>
         <w:rPr>
@@ -1423,7 +1669,7 @@
           <w:sz w:val="22"/>
           <w:u w:val="none"/>
         </w:rPr>
-        <w:t>Decreto 4.149 de 19/12/2019</w:t>
+        <w:t>Lei nº 1.544, de 04 de março de 1986 (Código de Obras)</w:t>
       </w:r>
       <w:r>
         <w:rPr>
@@ -1433,7 +1679,24 @@
           <w:sz w:val="22"/>
           <w:u w:val="none"/>
         </w:rPr>
-        <w:t>, Código de Obras do município de Oliveira (</w:t>
+        <w:t>, especificamente o Art. 79, que faculta ao poder público a aceitação de obras concluídas à revelia da prévia aprovação, desde que atestadas a segurança e a salubridade;</w:t>
+      </w:r>
+    </w:p>
+    <w:p>
+      <w:pPr>
+        <w:ind w:firstLine="709"/>
+        <w:jc w:val="both"/>
+        <w:spacing w:line="288" w:lineRule="auto" w:before="0" w:after="120"/>
+      </w:pPr>
+      <w:r>
+        <w:rPr>
+          <w:rFonts w:ascii="Calibri" w:hAnsi="Calibri" w:cs="Calibri"/>
+          <w:b w:val="0"/>
+          <w:i w:val="0"/>
+          <w:sz w:val="22"/>
+          <w:u w:val="none"/>
+        </w:rPr>
+        <w:t xml:space="preserve">• </w:t>
       </w:r>
       <w:r>
         <w:rPr>
@@ -1443,7 +1706,7 @@
           <w:sz w:val="22"/>
           <w:u w:val="none"/>
         </w:rPr>
-        <w:t>Lei nº 1.544, de 04 de março de 1986</w:t>
+        <w:t>Lei Complementar nº 267 de 11/11/2019 (Plano Diretor e Uso do Solo)</w:t>
       </w:r>
       <w:r>
         <w:rPr>
@@ -1453,27 +1716,7 @@
           <w:sz w:val="22"/>
           <w:u w:val="none"/>
         </w:rPr>
-        <w:t>) e Lei de Uso e Ocupação do Solo (</w:t>
-      </w:r>
-      <w:r>
-        <w:rPr>
-          <w:rFonts w:ascii="Calibri" w:hAnsi="Calibri" w:cs="Calibri"/>
-          <w:b w:val="0"/>
-          <w:i/>
-          <w:sz w:val="22"/>
-          <w:u w:val="none"/>
-        </w:rPr>
-        <w:t>Lei Complementar 267 de 11/11/2019</w:t>
-      </w:r>
-      <w:r>
-        <w:rPr>
-          <w:rFonts w:ascii="Calibri" w:hAnsi="Calibri" w:cs="Calibri"/>
-          <w:b w:val="0"/>
-          <w:i w:val="0"/>
-          <w:sz w:val="22"/>
-          <w:u w:val="none"/>
-        </w:rPr>
-        <w:t>).</w:t>
+        <w:t>, em seus Arts. 38 e 39, que estabelecem as diretrizes e contrapartidas pecuniárias (fundo urbano) para edificações que ultrapassam as balizas de ocupação e recuos da macrozona.</w:t>
       </w:r>
     </w:p>
     <w:p>
@@ -1508,7 +1751,7 @@
           <w:sz w:val="22"/>
           <w:u w:val="none"/>
         </w:rPr>
-        <w:t xml:space="preserve">No que tange ao processo de averbação, a análise documental demonstra que o imóvel não possui área construída averbada em sua matrícula atual. Tendo em vista que o levantamento constatou uma área total de </w:t>
+        <w:t xml:space="preserve">Sob os prismas da estrita legalidade e da razoabilidade técnica, conclui-se que a obra atende aos requisitos mínimos de estabilidade, higiene e inserção urbana exigidos pelo município. As pendências atinentes à comprovação dominial da fração ideal de 240,00m² foram sanadas satisfatoriamente. Sendo assim, profiro </w:t>
       </w:r>
       <w:r>
         <w:rPr>
@@ -1518,7 +1761,7 @@
           <w:sz w:val="22"/>
           <w:u w:val="none"/>
         </w:rPr>
-        <w:t>283,38m²</w:t>
+        <w:t>PARECER FAVORÁVEL</w:t>
       </w:r>
       <w:r>
         <w:rPr>
@@ -1528,10 +1771,7 @@
           <w:sz w:val="22"/>
           <w:u w:val="none"/>
         </w:rPr>
-        <w:t>, a respectiva averbação incidirá sobre a totalidade desta área.</w:t>
-        <w:br/>
-        <w:br/>
-        <w:t>Diante disso, aprovado e verificado o laudo, as áreas e as considerações do parecer fiscal, tendo sido sanadas as pendências documentais, constar:</w:t>
+        <w:t xml:space="preserve"> à regularização integral do imóvel, devendo-se processar a liquidação do passivo tributário restrito à área ampliada recente. Remetam-se os autos aos setores competentes para o recolhimento das guias e a subsequente emissão dos respectivos despachos de conformidade.</w:t>
       </w:r>
     </w:p>
     <w:tbl>
@@ -1568,7 +1808,7 @@
                 <w:sz w:val="22"/>
                 <w:u w:val="none"/>
               </w:rPr>
-              <w:t>Alvará de Regularização</w:t>
+              <w:t>Alvará de Regularização de Imóvel</w:t>
             </w:r>
           </w:p>
           <w:p>
@@ -1585,7 +1825,7 @@
                 <w:sz w:val="20"/>
                 <w:u w:val="none"/>
               </w:rPr>
-              <w:t xml:space="preserve">Alvará emitido para regularização de imóvel edificado sem projeto aprovado pela prefeitura, referente à área total de </w:t>
+              <w:t xml:space="preserve">Alvará autorizativo cobrindo a área total de </w:t>
             </w:r>
             <w:r>
               <w:rPr>
@@ -1607,7 +1847,7 @@
                 <w:sz w:val="20"/>
                 <w:u w:val="none"/>
               </w:rPr>
-              <w:t xml:space="preserve">, mediante o cumprimento do </w:t>
+              <w:t xml:space="preserve">. Fazer constar no campo 'Observações do Alvará' a excepcionalidade prevista no </w:t>
             </w:r>
             <w:r>
               <w:rPr>
@@ -1618,7 +1858,7 @@
                 <w:sz w:val="20"/>
                 <w:u w:val="none"/>
               </w:rPr>
-              <w:t>Art. 79 da Lei 1.544 de 1986</w:t>
+              <w:t>Art. 79 da Lei 1.544/86</w:t>
             </w:r>
             <w:r>
               <w:rPr>
@@ -1629,29 +1869,7 @@
                 <w:sz w:val="20"/>
                 <w:u w:val="none"/>
               </w:rPr>
-              <w:t xml:space="preserve"> e </w:t>
-            </w:r>
-            <w:r>
-              <w:rPr>
-                <w:rFonts w:ascii="Calibri" w:hAnsi="Calibri" w:cs="Calibri"/>
-                <w:b w:val="0"/>
-                <w:i/>
-                <w:color w:val="444444"/>
-                <w:sz w:val="20"/>
-                <w:u w:val="none"/>
-              </w:rPr>
-              <w:t>Art. 38, 39 da Lei Complementar 267 de 2019</w:t>
-            </w:r>
-            <w:r>
-              <w:rPr>
-                <w:rFonts w:ascii="Calibri" w:hAnsi="Calibri" w:cs="Calibri"/>
-                <w:b w:val="0"/>
-                <w:i w:val="0"/>
-                <w:color w:val="444444"/>
-                <w:sz w:val="20"/>
-                <w:u w:val="none"/>
-              </w:rPr>
-              <w:t>.</w:t>
+              <w:t>, ressalvando que a regularização atesta o estado de fato, mas não exime futuras manutenções estruturais a cargo do proprietário.</w:t>
             </w:r>
           </w:p>
         </w:tc>
@@ -1696,7 +1914,7 @@
                 <w:sz w:val="22"/>
                 <w:u w:val="none"/>
               </w:rPr>
-              <w:t>Carta de Habite-se</w:t>
+              <w:t>Certidão de Decadência Técnica</w:t>
             </w:r>
           </w:p>
           <w:p>
@@ -1713,7 +1931,113 @@
                 <w:sz w:val="20"/>
                 <w:u w:val="none"/>
               </w:rPr>
-              <w:t xml:space="preserve">Referente à área total de </w:t>
+              <w:t xml:space="preserve">Emissão de documento certificatório declarando o transcurso do lapso temporal quinquenal sobre a área base de </w:t>
+            </w:r>
+            <w:r>
+              <w:rPr>
+                <w:rFonts w:ascii="Calibri" w:hAnsi="Calibri" w:cs="Calibri"/>
+                <w:b/>
+                <w:i w:val="0"/>
+                <w:color w:val="444444"/>
+                <w:sz w:val="20"/>
+                <w:u w:val="none"/>
+              </w:rPr>
+              <w:t>163,72m²</w:t>
+            </w:r>
+            <w:r>
+              <w:rPr>
+                <w:rFonts w:ascii="Calibri" w:hAnsi="Calibri" w:cs="Calibri"/>
+                <w:b w:val="0"/>
+                <w:i w:val="0"/>
+                <w:color w:val="444444"/>
+                <w:sz w:val="20"/>
+                <w:u w:val="none"/>
+              </w:rPr>
+              <w:t xml:space="preserve">, conforme atestado pelo mosaico cadastral de </w:t>
+            </w:r>
+            <w:r>
+              <w:rPr>
+                <w:rFonts w:ascii="Calibri" w:hAnsi="Calibri" w:cs="Calibri"/>
+                <w:b/>
+                <w:i w:val="0"/>
+                <w:color w:val="444444"/>
+                <w:sz w:val="20"/>
+                <w:u w:val="none"/>
+              </w:rPr>
+              <w:t>13/11/2012</w:t>
+            </w:r>
+            <w:r>
+              <w:rPr>
+                <w:rFonts w:ascii="Calibri" w:hAnsi="Calibri" w:cs="Calibri"/>
+                <w:b w:val="0"/>
+                <w:i w:val="0"/>
+                <w:color w:val="444444"/>
+                <w:sz w:val="20"/>
+                <w:u w:val="none"/>
+              </w:rPr>
+              <w:t>, isentando-a de tributação compensatória.</w:t>
+            </w:r>
+          </w:p>
+        </w:tc>
+      </w:tr>
+    </w:tbl>
+    <w:p>
+      <w:pPr>
+        <w:spacing w:line="80" w:lineRule="auto" w:before="0" w:after="0"/>
+      </w:pPr>
+    </w:p>
+    <w:tbl>
+      <w:tblPr>
+        <w:tblW w:type="auto" w:w="0"/>
+        <w:jc w:val="center"/>
+        <w:tblLook w:firstColumn="1" w:firstRow="1" w:lastColumn="0" w:lastRow="0" w:noHBand="0" w:noVBand="1" w:val="04A0"/>
+        <w:tblBorders>
+          <w:top w:val="single" w:sz="4" w:color="D6DCE4" w:space="0"/>
+          <w:bottom w:val="single" w:sz="4" w:color="D6DCE4" w:space="0"/>
+          <w:right w:val="single" w:sz="4" w:color="D6DCE4" w:space="0"/>
+          <w:left w:val="single" w:sz="18" w:color="1F3864" w:space="0"/>
+        </w:tblBorders>
+      </w:tblPr>
+      <w:tblGrid>
+        <w:gridCol w:w="10206"/>
+      </w:tblGrid>
+      <w:tr>
+        <w:tc>
+          <w:tcPr>
+            <w:tcW w:type="dxa" w:w="10206"/>
+            <w:shd w:fill="F8F9FA" w:val="clear"/>
+          </w:tcPr>
+          <w:p>
+            <w:pPr>
+              <w:jc w:val="both"/>
+              <w:spacing w:line="288" w:lineRule="auto" w:before="40" w:after="20"/>
+            </w:pPr>
+            <w:r>
+              <w:rPr>
+                <w:rFonts w:ascii="Calibri" w:hAnsi="Calibri" w:cs="Calibri"/>
+                <w:b/>
+                <w:i w:val="0"/>
+                <w:sz w:val="22"/>
+                <w:u w:val="none"/>
+              </w:rPr>
+              <w:t>Carta de Habite-se (Multifamiliar)</w:t>
+            </w:r>
+          </w:p>
+          <w:p>
+            <w:pPr>
+              <w:jc w:val="both"/>
+              <w:spacing w:line="280" w:lineRule="auto" w:before="0" w:after="40"/>
+            </w:pPr>
+            <w:r>
+              <w:rPr>
+                <w:rFonts w:ascii="Calibri" w:hAnsi="Calibri" w:cs="Calibri"/>
+                <w:b w:val="0"/>
+                <w:i w:val="0"/>
+                <w:color w:val="444444"/>
+                <w:sz w:val="20"/>
+                <w:u w:val="none"/>
+              </w:rPr>
+              <w:t xml:space="preserve">Expedição atestando a habitabilidade e conclusão global da edificação de </w:t>
             </w:r>
             <w:r>
               <w:rPr>
@@ -1735,7 +2059,7 @@
                 <w:sz w:val="20"/>
                 <w:u w:val="none"/>
               </w:rPr>
-              <w:t>.</w:t>
+              <w:t>, permitindo ao requerente efetuar a ligação definitiva das concessionárias (água, luz e esgoto).</w:t>
             </w:r>
           </w:p>
         </w:tc>
@@ -1797,7 +2121,7 @@
                 <w:sz w:val="20"/>
                 <w:u w:val="none"/>
               </w:rPr>
-              <w:t xml:space="preserve">Referente à área total de </w:t>
+              <w:t xml:space="preserve">Instrumento final destinado ao Serviço de Registro de Imóveis (SRI), atestando que a edificação atual de </w:t>
             </w:r>
             <w:r>
               <w:rPr>
@@ -1819,69 +2143,7 @@
                 <w:sz w:val="20"/>
                 <w:u w:val="none"/>
               </w:rPr>
-              <w:t>.</w:t>
-            </w:r>
-          </w:p>
-        </w:tc>
-      </w:tr>
-    </w:tbl>
-    <w:p>
-      <w:pPr>
-        <w:spacing w:line="80" w:lineRule="auto" w:before="0" w:after="0"/>
-      </w:pPr>
-    </w:p>
-    <w:tbl>
-      <w:tblPr>
-        <w:tblW w:type="auto" w:w="0"/>
-        <w:jc w:val="center"/>
-        <w:tblLook w:firstColumn="1" w:firstRow="1" w:lastColumn="0" w:lastRow="0" w:noHBand="0" w:noVBand="1" w:val="04A0"/>
-        <w:tblBorders>
-          <w:top w:val="single" w:sz="4" w:color="D6DCE4" w:space="0"/>
-          <w:bottom w:val="single" w:sz="4" w:color="D6DCE4" w:space="0"/>
-          <w:right w:val="single" w:sz="4" w:color="D6DCE4" w:space="0"/>
-          <w:left w:val="single" w:sz="18" w:color="1F3864" w:space="0"/>
-        </w:tblBorders>
-      </w:tblPr>
-      <w:tblGrid>
-        <w:gridCol w:w="10206"/>
-      </w:tblGrid>
-      <w:tr>
-        <w:tc>
-          <w:tcPr>
-            <w:tcW w:type="dxa" w:w="10206"/>
-            <w:shd w:fill="F8F9FA" w:val="clear"/>
-          </w:tcPr>
-          <w:p>
-            <w:pPr>
-              <w:jc w:val="both"/>
-              <w:spacing w:line="288" w:lineRule="auto" w:before="40" w:after="20"/>
-            </w:pPr>
-            <w:r>
-              <w:rPr>
-                <w:rFonts w:ascii="Calibri" w:hAnsi="Calibri" w:cs="Calibri"/>
-                <w:b/>
-                <w:i w:val="0"/>
-                <w:sz w:val="22"/>
-                <w:u w:val="none"/>
-              </w:rPr>
-              <w:t>Certidão de Decadência</w:t>
-            </w:r>
-          </w:p>
-          <w:p>
-            <w:pPr>
-              <w:jc w:val="both"/>
-              <w:spacing w:line="280" w:lineRule="auto" w:before="0" w:after="40"/>
-            </w:pPr>
-            <w:r>
-              <w:rPr>
-                <w:rFonts w:ascii="Calibri" w:hAnsi="Calibri" w:cs="Calibri"/>
-                <w:b w:val="0"/>
-                <w:i w:val="0"/>
-                <w:color w:val="444444"/>
-                <w:sz w:val="20"/>
-                <w:u w:val="none"/>
-              </w:rPr>
-              <w:t xml:space="preserve">Conforme Planta Cadastral do município com Data de Cadastro em </w:t>
+              <w:t xml:space="preserve"> encontra-se regular perante a Municipalidade de Oliveira para averbação na Matrícula </w:t>
             </w:r>
             <w:r>
               <w:rPr>
@@ -1892,7 +2154,7 @@
                 <w:sz w:val="20"/>
                 <w:u w:val="none"/>
               </w:rPr>
-              <w:t>13/11/2012</w:t>
+              <w:t>9833</w:t>
             </w:r>
             <w:r>
               <w:rPr>
@@ -1903,29 +2165,7 @@
                 <w:sz w:val="20"/>
                 <w:u w:val="none"/>
               </w:rPr>
-              <w:t xml:space="preserve">, atesta-se a existência consolidada de </w:t>
-            </w:r>
-            <w:r>
-              <w:rPr>
-                <w:rFonts w:ascii="Calibri" w:hAnsi="Calibri" w:cs="Calibri"/>
-                <w:b/>
-                <w:i w:val="0"/>
-                <w:color w:val="444444"/>
-                <w:sz w:val="20"/>
-                <w:u w:val="none"/>
-              </w:rPr>
-              <w:t>163,72m²</w:t>
-            </w:r>
-            <w:r>
-              <w:rPr>
-                <w:rFonts w:ascii="Calibri" w:hAnsi="Calibri" w:cs="Calibri"/>
-                <w:b w:val="0"/>
-                <w:i w:val="0"/>
-                <w:color w:val="444444"/>
-                <w:sz w:val="20"/>
-                <w:u w:val="none"/>
-              </w:rPr>
-              <w:t xml:space="preserve"> de área construída no lote, garantindo a decadência para esta parcela do imóvel.</w:t>
+              <w:t>.</w:t>
             </w:r>
           </w:p>
         </w:tc>

</xml_diff>